<commit_message>
Add project details page and update styles
- Introduced a new route for the project details page in app.py.
- Created project_details.html to provide comprehensive information about the simulation.
- Updated index.html to include a button linking to the new project details page.
- Added styles for the details button in style.css.
- Removed temporary Record.docx file.
</commit_message>
<xml_diff>
--- a/Record.docx
+++ b/Record.docx
@@ -102,7 +102,7 @@
           <w:noProof/>
           <w:kern w:val="0"/>
         </w:rPr>
-        <w:pict w14:anchorId="1486D5CB">
+        <w:pict w14:anchorId="38BCA754">
           <v:rect id="_x0000_i1026" alt="" style="width:451.3pt;height:.05pt;mso-width-percent:0;mso-height-percent:0;mso-width-percent:0;mso-height-percent:0" o:hralign="center" o:hrstd="t" o:hr="t" fillcolor="#a0a0a0" stroked="f"/>
         </w:pict>
       </w:r>
@@ -1320,7 +1320,7 @@
           <w:noProof/>
           <w:kern w:val="0"/>
         </w:rPr>
-        <w:pict w14:anchorId="2B52D3C2">
+        <w:pict w14:anchorId="65AB7AC9">
           <v:rect id="_x0000_i1025" alt="" style="width:451.3pt;height:.05pt;mso-width-percent:0;mso-height-percent:0;mso-width-percent:0;mso-height-percent:0" o:hralign="center" o:hrstd="t" o:hr="t" fillcolor="#a0a0a0" stroked="f"/>
         </w:pict>
       </w:r>
@@ -2282,6 +2282,9 @@
         <w:tabs>
           <w:tab w:val="left" w:pos="6779"/>
         </w:tabs>
+        <w:rPr>
+          <w:lang w:val="en-US"/>
+        </w:rPr>
       </w:pPr>
       <w:r>
         <w:t>2. Error: Failed to fetch after setting the offspring_per_survivor to 2</w:t>

</xml_diff>